<commit_message>
Actualizar programa: retirar información pendiente y corregir web
</commit_message>
<xml_diff>
--- a/assets/programa-provisional-flabx.docx
+++ b/assets/programa-provisional-flabx.docx
@@ -120,7 +120,7 @@
         <w:rPr>
           <w:sz w:val="18"/>
         </w:rPr>
-        <w:t>Horarios y duraciones propuestos, sujetos a confirmación. Las modalidades no declaradas y los enlaces de acceso se completarán en la versión definitiva.</w:t>
+        <w:t>Horarios y duraciones propuestos, sujetos a confirmación.</w:t>
       </w:r>
     </w:p>
     <w:p>
@@ -4389,27 +4389,11 @@
       </w:r>
     </w:p>
     <w:p>
-      <w:pPr>
-        <w:pStyle w:val="Heading2"/>
-      </w:pPr>
-      <w:r>
-        <w:t>Información pendiente de completar</w:t>
-      </w:r>
-    </w:p>
-    <w:p>
-      <w:r>
-        <w:rPr>
-          <w:sz w:val="18"/>
-        </w:rPr>
-        <w:t>Modalidades presenciales u online no declaradas, enlaces de acceso e instrucciones del taller asíncrono.</w:t>
-      </w:r>
-    </w:p>
-    <w:p>
       <w:r>
         <w:rPr>
           <w:sz w:val="16"/>
         </w:rPr>
-        <w:t>Web del congreso: https://flabxuva.my.canva.site/el-congreso</w:t>
+        <w:t>Web del congreso: https://flabxproject.github.io/flabxconference/</w:t>
       </w:r>
     </w:p>
     <w:sectPr>

</xml_diff>

<commit_message>
Ordenar programa por día y hora con talleres y descansos integrados
</commit_message>
<xml_diff>
--- a/assets/programa-provisional-flabx.docx
+++ b/assets/programa-provisional-flabx.docx
@@ -2858,20 +2858,376 @@
         <w:pStyle w:val="Heading1"/>
       </w:pPr>
       <w:r>
-        <w:t>Plenaria y talleres invitados</w:t>
+        <w:t>Lunes 16 de noviembre</w:t>
       </w:r>
     </w:p>
     <w:p>
       <w:pPr>
+        <w:spacing w:after="100"/>
+      </w:pPr>
+      <w:r>
+        <w:rPr>
+          <w:b w:val="0"/>
+          <w:sz w:val="20"/>
+        </w:rPr>
+        <w:t>09:00–10:45 : Hora peninsular española</w:t>
+      </w:r>
+    </w:p>
+    <w:p>
+      <w:pPr>
         <w:keepNext/>
-        <w:spacing w:before="240" w:after="60"/>
+        <w:spacing w:before="180" w:after="100"/>
       </w:pPr>
       <w:r>
         <w:rPr>
           <w:b/>
           <w:color w:val="003973"/>
         </w:rPr>
-        <w:t>LUNES 16: 10:45–11:30</w:t>
+        <w:t>09:00–09:15: Inauguración: Salón de Grados</w:t>
+      </w:r>
+    </w:p>
+    <w:p>
+      <w:pPr>
+        <w:spacing w:after="100"/>
+      </w:pPr>
+      <w:r>
+        <w:rPr>
+          <w:b w:val="0"/>
+          <w:sz w:val="20"/>
+        </w:rPr>
+        <w:t>Dña. Mamen Garrido Hornos, vicerrectora del Campus de Segovia</w:t>
+      </w:r>
+    </w:p>
+    <w:p>
+      <w:pPr>
+        <w:keepNext/>
+        <w:spacing w:before="180" w:after="100"/>
+      </w:pPr>
+      <w:r>
+        <w:rPr>
+          <w:b/>
+          <w:color w:val="003973"/>
+        </w:rPr>
+        <w:t>09:15–10:15: Sesión 1: IA y aprendizaje: Salón de Grados</w:t>
+      </w:r>
+    </w:p>
+    <w:p>
+      <w:pPr>
+        <w:keepNext/>
+        <w:spacing w:before="240" w:after="60"/>
+      </w:pPr>
+      <w:r>
+        <w:rPr>
+          <w:b/>
+          <w:color w:val="003973"/>
+        </w:rPr>
+        <w:t>09:15–09:30</w:t>
+      </w:r>
+    </w:p>
+    <w:p>
+      <w:pPr>
+        <w:keepNext/>
+        <w:spacing w:after="60"/>
+      </w:pPr>
+      <w:r>
+        <w:rPr>
+          <w:b/>
+          <w:sz w:val="22"/>
+        </w:rPr>
+        <w:t>Diseño e implementación de un asistente virtual especializado en ChatGPT como herramienta de apoyo en la asignatura de Psicología del Desarrollo</w:t>
+      </w:r>
+    </w:p>
+    <w:p>
+      <w:pPr>
+        <w:keepNext/>
+        <w:spacing w:after="60"/>
+      </w:pPr>
+      <w:r>
+        <w:t>Laura Esteban Gómez</w:t>
+      </w:r>
+    </w:p>
+    <w:p>
+      <w:pPr>
+        <w:spacing w:after="100"/>
+      </w:pPr>
+      <w:r>
+        <w:rPr>
+          <w:color w:val="4D4D4D"/>
+          <w:sz w:val="18"/>
+        </w:rPr>
+        <w:t>Comunicación oral  |  Modalidad: Por confirmar  |  Salón de Grados</w:t>
+      </w:r>
+    </w:p>
+    <w:p>
+      <w:pPr>
+        <w:keepNext/>
+        <w:spacing w:before="240" w:after="60"/>
+      </w:pPr>
+      <w:r>
+        <w:rPr>
+          <w:b/>
+          <w:color w:val="003973"/>
+        </w:rPr>
+        <w:t>09:30–09:45</w:t>
+      </w:r>
+    </w:p>
+    <w:p>
+      <w:pPr>
+        <w:keepNext/>
+        <w:spacing w:after="60"/>
+      </w:pPr>
+      <w:r>
+        <w:rPr>
+          <w:b/>
+          <w:sz w:val="22"/>
+        </w:rPr>
+        <w:t>Inteligencia artificial generativa en secundaria: Un análisis cualitativo de sus prácticas y brechas cognitivas</w:t>
+      </w:r>
+    </w:p>
+    <w:p>
+      <w:pPr>
+        <w:keepNext/>
+        <w:spacing w:after="60"/>
+      </w:pPr>
+      <w:r>
+        <w:t>Natalia Castellanos Nieto</w:t>
+      </w:r>
+    </w:p>
+    <w:p>
+      <w:pPr>
+        <w:spacing w:after="100"/>
+      </w:pPr>
+      <w:r>
+        <w:rPr>
+          <w:color w:val="4D4D4D"/>
+          <w:sz w:val="18"/>
+        </w:rPr>
+        <w:t>Comunicación oral  |  Modalidad: Por confirmar  |  Salón de Grados</w:t>
+      </w:r>
+    </w:p>
+    <w:p>
+      <w:pPr>
+        <w:keepNext/>
+        <w:spacing w:before="240" w:after="60"/>
+      </w:pPr>
+      <w:r>
+        <w:rPr>
+          <w:b/>
+          <w:color w:val="003973"/>
+        </w:rPr>
+        <w:t>09:45–10:00</w:t>
+      </w:r>
+    </w:p>
+    <w:p>
+      <w:pPr>
+        <w:keepNext/>
+        <w:spacing w:after="60"/>
+      </w:pPr>
+      <w:r>
+        <w:rPr>
+          <w:b/>
+          <w:sz w:val="22"/>
+        </w:rPr>
+        <w:t>Inteligencia artificial generativa y personalización del aprendizaje: posibilidades y limitaciones para responder a la diversidad en Educación Secundaria</w:t>
+      </w:r>
+    </w:p>
+    <w:p>
+      <w:pPr>
+        <w:keepNext/>
+        <w:spacing w:after="60"/>
+      </w:pPr>
+      <w:r>
+        <w:t>Ana Isabel García Fuertes</w:t>
+      </w:r>
+    </w:p>
+    <w:p>
+      <w:pPr>
+        <w:spacing w:after="100"/>
+      </w:pPr>
+      <w:r>
+        <w:rPr>
+          <w:color w:val="4D4D4D"/>
+          <w:sz w:val="18"/>
+        </w:rPr>
+        <w:t>Comunicación oral  |  Modalidad: Por confirmar  |  Salón de Grados</w:t>
+      </w:r>
+    </w:p>
+    <w:p>
+      <w:pPr>
+        <w:keepNext/>
+        <w:spacing w:before="240" w:after="60"/>
+      </w:pPr>
+      <w:r>
+        <w:rPr>
+          <w:b/>
+          <w:color w:val="003973"/>
+        </w:rPr>
+        <w:t>10:00–10:15</w:t>
+      </w:r>
+    </w:p>
+    <w:p>
+      <w:pPr>
+        <w:keepNext/>
+        <w:spacing w:after="60"/>
+      </w:pPr>
+      <w:r>
+        <w:rPr>
+          <w:b/>
+          <w:sz w:val="22"/>
+        </w:rPr>
+        <w:t>Aprender conceptos abstractos mediante Notebooklm</w:t>
+      </w:r>
+    </w:p>
+    <w:p>
+      <w:pPr>
+        <w:keepNext/>
+        <w:spacing w:after="60"/>
+      </w:pPr>
+      <w:r>
+        <w:t>Ana Gabriela Caballero Vilchez</w:t>
+      </w:r>
+    </w:p>
+    <w:p>
+      <w:pPr>
+        <w:spacing w:after="100"/>
+      </w:pPr>
+      <w:r>
+        <w:rPr>
+          <w:color w:val="4D4D4D"/>
+          <w:sz w:val="18"/>
+        </w:rPr>
+        <w:t>Comunicación oral  |  Modalidad: Por confirmar  |  Salón de Grados</w:t>
+      </w:r>
+    </w:p>
+    <w:p>
+      <w:pPr>
+        <w:spacing w:after="100" w:before="140"/>
+      </w:pPr>
+      <w:r>
+        <w:rPr>
+          <w:b/>
+          <w:sz w:val="20"/>
+        </w:rPr>
+        <w:t>10:15–10:45: Descanso</w:t>
+      </w:r>
+    </w:p>
+    <w:p>
+      <w:pPr>
+        <w:keepNext/>
+        <w:spacing w:before="180" w:after="100"/>
+      </w:pPr>
+      <w:r>
+        <w:rPr>
+          <w:b/>
+          <w:color w:val="003973"/>
+        </w:rPr>
+        <w:t>10:15–10:30: Proyección de pósteres durante el descanso: Salón de Grados</w:t>
+      </w:r>
+    </w:p>
+    <w:p>
+      <w:pPr>
+        <w:keepNext/>
+        <w:spacing w:after="60"/>
+      </w:pPr>
+      <w:r>
+        <w:rPr>
+          <w:b/>
+          <w:sz w:val="22"/>
+        </w:rPr>
+        <w:t>De la clínica a la investigación: formación multimodal de una red de matronas para la recogida estandarizada de datos</w:t>
+      </w:r>
+    </w:p>
+    <w:p>
+      <w:pPr>
+        <w:keepNext/>
+        <w:spacing w:after="60"/>
+      </w:pPr>
+      <w:r>
+        <w:t>Nuria García Cuadrado y Verónica Velasco González</w:t>
+      </w:r>
+    </w:p>
+    <w:p>
+      <w:pPr>
+        <w:spacing w:after="100"/>
+      </w:pPr>
+      <w:r>
+        <w:rPr>
+          <w:color w:val="4D4D4D"/>
+          <w:sz w:val="18"/>
+        </w:rPr>
+        <w:t>Póster académico  |  Modalidad: Por confirmar  |  Salón de Grados</w:t>
+      </w:r>
+    </w:p>
+    <w:p>
+      <w:pPr>
+        <w:keepNext/>
+        <w:spacing w:after="60"/>
+      </w:pPr>
+      <w:r>
+        <w:rPr>
+          <w:b/>
+          <w:sz w:val="22"/>
+        </w:rPr>
+        <w:t>Diseño de una aplicación digital para la gestión y divulgación científica en clubes de ciencias de educación básica</w:t>
+      </w:r>
+    </w:p>
+    <w:p>
+      <w:pPr>
+        <w:keepNext/>
+        <w:spacing w:after="60"/>
+      </w:pPr>
+      <w:r>
+        <w:t>Loanda Alves Triboli</w:t>
+      </w:r>
+    </w:p>
+    <w:p>
+      <w:pPr>
+        <w:spacing w:after="100"/>
+      </w:pPr>
+      <w:r>
+        <w:rPr>
+          <w:color w:val="4D4D4D"/>
+          <w:sz w:val="18"/>
+        </w:rPr>
+        <w:t>Póster académico  |  Modalidad: Online  |  Salón de Grados</w:t>
+      </w:r>
+    </w:p>
+    <w:p>
+      <w:r>
+        <w:br w:type="page"/>
+      </w:r>
+    </w:p>
+    <w:p>
+      <w:pPr>
+        <w:pStyle w:val="Heading1"/>
+      </w:pPr>
+      <w:r>
+        <w:t>Lunes 16 de noviembre</w:t>
+      </w:r>
+    </w:p>
+    <w:p>
+      <w:pPr>
+        <w:spacing w:after="100"/>
+      </w:pPr>
+      <w:r>
+        <w:rPr>
+          <w:b w:val="0"/>
+          <w:sz w:val="20"/>
+        </w:rPr>
+        <w:t>10:45–13:45 : Hora peninsular española</w:t>
+      </w:r>
+    </w:p>
+    <w:p>
+      <w:pPr>
+        <w:keepNext/>
+        <w:spacing w:before="240" w:after="60"/>
+      </w:pPr>
+      <w:r>
+        <w:rPr>
+          <w:b/>
+          <w:color w:val="003973"/>
+        </w:rPr>
+        <w:t>10:45–11:30</w:t>
       </w:r>
     </w:p>
     <w:p>
@@ -2911,14 +3267,27 @@
     <w:p>
       <w:pPr>
         <w:keepNext/>
-        <w:spacing w:before="240" w:after="60"/>
+        <w:spacing w:before="180" w:after="100"/>
       </w:pPr>
       <w:r>
         <w:rPr>
           <w:b/>
           <w:color w:val="003973"/>
         </w:rPr>
-        <w:t>LUNES 16: 16:00–17:00</w:t>
+        <w:t>11:30–12:30: Sesión 2: Metodologías activas y ciencias: Salón de Grados</w:t>
+      </w:r>
+    </w:p>
+    <w:p>
+      <w:pPr>
+        <w:keepNext/>
+        <w:spacing w:before="240" w:after="60"/>
+      </w:pPr>
+      <w:r>
+        <w:rPr>
+          <w:b/>
+          <w:color w:val="003973"/>
+        </w:rPr>
+        <w:t>11:30–11:45</w:t>
       </w:r>
     </w:p>
     <w:p>
@@ -2931,7 +3300,7 @@
           <w:b/>
           <w:sz w:val="22"/>
         </w:rPr>
-        <w:t>Los cuentos como herramienta didáctica en el aula de inglés: Reading Awakening</w:t>
+        <w:t>El lapbook como recurso innovador</w:t>
       </w:r>
     </w:p>
     <w:p>
@@ -2940,128 +3309,7 @@
         <w:spacing w:after="60"/>
       </w:pPr>
       <w:r>
-        <w:t>Débora Rascón Estébanez</w:t>
-      </w:r>
-    </w:p>
-    <w:p>
-      <w:pPr>
-        <w:spacing w:after="100"/>
-      </w:pPr>
-      <w:r>
-        <w:rPr>
-          <w:color w:val="4D4D4D"/>
-          <w:sz w:val="18"/>
-        </w:rPr>
-        <w:t>Taller: 60 minutos propuestos  |  Modalidad: Por confirmar  |  Aula 117</w:t>
-      </w:r>
-    </w:p>
-    <w:p>
-      <w:pPr>
-        <w:keepNext/>
-        <w:spacing w:before="240" w:after="60"/>
-      </w:pPr>
-      <w:r>
-        <w:rPr>
-          <w:b/>
-          <w:color w:val="003973"/>
-        </w:rPr>
-        <w:t>MARTES 17: 12:15–13:15</w:t>
-      </w:r>
-    </w:p>
-    <w:p>
-      <w:pPr>
-        <w:keepNext/>
-        <w:spacing w:after="60"/>
-      </w:pPr>
-      <w:r>
-        <w:rPr>
-          <w:b/>
-          <w:sz w:val="22"/>
-        </w:rPr>
-        <w:t>De la idea al aula: creación de recursos educativos con IA</w:t>
-      </w:r>
-    </w:p>
-    <w:p>
-      <w:pPr>
-        <w:keepNext/>
-        <w:spacing w:after="60"/>
-      </w:pPr>
-      <w:r>
-        <w:t>María Sanabria</w:t>
-      </w:r>
-    </w:p>
-    <w:p>
-      <w:pPr>
-        <w:spacing w:after="100"/>
-      </w:pPr>
-      <w:r>
-        <w:rPr>
-          <w:color w:val="4D4D4D"/>
-          <w:sz w:val="18"/>
-        </w:rPr>
-        <w:t>Taller: 60 minutos propuestos  |  Modalidad: Por confirmar  |  Aula 117</w:t>
-      </w:r>
-    </w:p>
-    <w:p>
-      <w:r>
-        <w:br w:type="page"/>
-      </w:r>
-    </w:p>
-    <w:p>
-      <w:pPr>
-        <w:pStyle w:val="Subtitle"/>
-      </w:pPr>
-      <w:r>
-        <w:t>LUNES 16 DE NOVIEMBRE</w:t>
-      </w:r>
-    </w:p>
-    <w:p>
-      <w:pPr>
-        <w:pStyle w:val="Heading1"/>
-      </w:pPr>
-      <w:r>
-        <w:t>Sesión 1: IA y aprendizaje</w:t>
-      </w:r>
-    </w:p>
-    <w:p>
-      <w:pPr/>
-      <w:r>
-        <w:t>Horario propuesto: Hora peninsular española</w:t>
-      </w:r>
-    </w:p>
-    <w:p>
-      <w:pPr>
-        <w:keepNext/>
-        <w:spacing w:before="240" w:after="60"/>
-      </w:pPr>
-      <w:r>
-        <w:rPr>
-          <w:b/>
-          <w:color w:val="003973"/>
-        </w:rPr>
-        <w:t>09:15–09:30</w:t>
-      </w:r>
-    </w:p>
-    <w:p>
-      <w:pPr>
-        <w:keepNext/>
-        <w:spacing w:after="60"/>
-      </w:pPr>
-      <w:r>
-        <w:rPr>
-          <w:b/>
-          <w:sz w:val="22"/>
-        </w:rPr>
-        <w:t>Diseño e implementación de un asistente virtual especializado en ChatGPT como herramienta de apoyo en la asignatura de Psicología del Desarrollo</w:t>
-      </w:r>
-    </w:p>
-    <w:p>
-      <w:pPr>
-        <w:keepNext/>
-        <w:spacing w:after="60"/>
-      </w:pPr>
-      <w:r>
-        <w:t>Laura Esteban Gómez</w:t>
+        <w:t>Sarahi Quevedo Abad y Noelia Santamaría-Cárdaba</w:t>
       </w:r>
     </w:p>
     <w:p>
@@ -3086,7 +3334,7 @@
           <w:b/>
           <w:color w:val="003973"/>
         </w:rPr>
-        <w:t>09:30–09:45</w:t>
+        <w:t>11:45–12:00</w:t>
       </w:r>
     </w:p>
     <w:p>
@@ -3099,7 +3347,7 @@
           <w:b/>
           <w:sz w:val="22"/>
         </w:rPr>
-        <w:t>Inteligencia artificial generativa en secundaria: Un análisis cualitativo de sus prácticas y brechas cognitivas</w:t>
+        <w:t>La introducción de procesos de indagación a través del trabajo por proyectos: un estudio de caso en el aula de 3 años.</w:t>
       </w:r>
     </w:p>
     <w:p>
@@ -3108,7 +3356,7 @@
         <w:spacing w:after="60"/>
       </w:pPr>
       <w:r>
-        <w:t>Natalia Castellanos Nieto</w:t>
+        <w:t>Irene Pérez-Sánchez, Denise Caja-Canseco y Vanessa Ortega-Quevedo</w:t>
       </w:r>
     </w:p>
     <w:p>
@@ -3133,7 +3381,7 @@
           <w:b/>
           <w:color w:val="003973"/>
         </w:rPr>
-        <w:t>09:45–10:00</w:t>
+        <w:t>12:00–12:15</w:t>
       </w:r>
     </w:p>
     <w:p>
@@ -3146,7 +3394,7 @@
           <w:b/>
           <w:sz w:val="22"/>
         </w:rPr>
-        <w:t>Inteligencia artificial generativa y personalización del aprendizaje: posibilidades y limitaciones para responder a la diversidad en Educación Secundaria</w:t>
+        <w:t>“La Liga Científica Grand Prix”: gamificación y aprendizaje cooperativo en la enseñanza de Física y Química</w:t>
       </w:r>
     </w:p>
     <w:p>
@@ -3155,7 +3403,7 @@
         <w:spacing w:after="60"/>
       </w:pPr>
       <w:r>
-        <w:t>Ana Isabel García Fuertes</w:t>
+        <w:t>Denise Caja-Canseco, Irene Pérez-Sánchez y Vanessa Ortega-Quevedo</w:t>
       </w:r>
     </w:p>
     <w:p>
@@ -3180,7 +3428,7 @@
           <w:b/>
           <w:color w:val="003973"/>
         </w:rPr>
-        <w:t>10:00–10:15</w:t>
+        <w:t>12:15–12:30</w:t>
       </w:r>
     </w:p>
     <w:p>
@@ -3193,7 +3441,7 @@
           <w:b/>
           <w:sz w:val="22"/>
         </w:rPr>
-        <w:t>Aprender conceptos abstractos mediante Notebooklm</w:t>
+        <w:t>De leer a comprender: elaboración de esquemas y resúmenes como estrategias metacognitivas para el aprendizaje de las reacciones químicas en 3º de ESO</w:t>
       </w:r>
     </w:p>
     <w:p>
@@ -3202,7 +3450,7 @@
         <w:spacing w:after="60"/>
       </w:pPr>
       <w:r>
-        <w:t>Ana Gabriela Caballero Vilchez</w:t>
+        <w:t>Denise Caja-Canseco, Irene Pérez-Sánchez y Vanessa Ortega-Quevedo</w:t>
       </w:r>
     </w:p>
     <w:p>
@@ -3218,38 +3466,15 @@
       </w:r>
     </w:p>
     <w:p>
+      <w:pPr>
+        <w:spacing w:after="100" w:before="140"/>
+      </w:pPr>
       <w:r>
         <w:rPr>
-          <w:sz w:val="16"/>
+          <w:b/>
+          <w:sz w:val="20"/>
         </w:rPr>
-        <w:t>Cada turno de comunicación oral reserva hasta 12 minutos de exposición y 3 de preguntas o transición.</w:t>
-      </w:r>
-    </w:p>
-    <w:p>
-      <w:r>
-        <w:br w:type="page"/>
-      </w:r>
-    </w:p>
-    <w:p>
-      <w:pPr>
-        <w:pStyle w:val="Subtitle"/>
-      </w:pPr>
-      <w:r>
-        <w:t>LUNES 16 DE NOVIEMBRE</w:t>
-      </w:r>
-    </w:p>
-    <w:p>
-      <w:pPr>
-        <w:pStyle w:val="Heading1"/>
-      </w:pPr>
-      <w:r>
-        <w:t>Sesión 2: Metodologías activas y ciencias</w:t>
-      </w:r>
-    </w:p>
-    <w:p>
-      <w:pPr/>
-      <w:r>
-        <w:t>Horario propuesto: Hora peninsular española</w:t>
+        <w:t>12:30–13:00: Descanso</w:t>
       </w:r>
     </w:p>
     <w:p>
@@ -3262,756 +3487,7 @@
           <w:b/>
           <w:color w:val="003973"/>
         </w:rPr>
-        <w:t>11:30–11:45</w:t>
-      </w:r>
-    </w:p>
-    <w:p>
-      <w:pPr>
-        <w:keepNext/>
-        <w:spacing w:after="60"/>
-      </w:pPr>
-      <w:r>
-        <w:rPr>
-          <w:b/>
-          <w:sz w:val="22"/>
-        </w:rPr>
-        <w:t>El lapbook como recurso innovador</w:t>
-      </w:r>
-    </w:p>
-    <w:p>
-      <w:pPr>
-        <w:keepNext/>
-        <w:spacing w:after="60"/>
-      </w:pPr>
-      <w:r>
-        <w:t>Sarahi Quevedo Abad y Noelia Santamaría-Cárdaba</w:t>
-      </w:r>
-    </w:p>
-    <w:p>
-      <w:pPr>
-        <w:spacing w:after="100"/>
-      </w:pPr>
-      <w:r>
-        <w:rPr>
-          <w:color w:val="4D4D4D"/>
-          <w:sz w:val="18"/>
-        </w:rPr>
-        <w:t>Comunicación oral  |  Modalidad: Por confirmar  |  Salón de Grados</w:t>
-      </w:r>
-    </w:p>
-    <w:p>
-      <w:pPr>
-        <w:keepNext/>
-        <w:spacing w:before="240" w:after="60"/>
-      </w:pPr>
-      <w:r>
-        <w:rPr>
-          <w:b/>
-          <w:color w:val="003973"/>
-        </w:rPr>
-        <w:t>11:45–12:00</w:t>
-      </w:r>
-    </w:p>
-    <w:p>
-      <w:pPr>
-        <w:keepNext/>
-        <w:spacing w:after="60"/>
-      </w:pPr>
-      <w:r>
-        <w:rPr>
-          <w:b/>
-          <w:sz w:val="22"/>
-        </w:rPr>
-        <w:t>La introducción de procesos de indagación a través del trabajo por proyectos: un estudio de caso en el aula de 3 años.</w:t>
-      </w:r>
-    </w:p>
-    <w:p>
-      <w:pPr>
-        <w:keepNext/>
-        <w:spacing w:after="60"/>
-      </w:pPr>
-      <w:r>
-        <w:t>Irene Pérez-Sánchez, Denise Caja-Canseco y Vanessa Ortega-Quevedo</w:t>
-      </w:r>
-    </w:p>
-    <w:p>
-      <w:pPr>
-        <w:spacing w:after="100"/>
-      </w:pPr>
-      <w:r>
-        <w:rPr>
-          <w:color w:val="4D4D4D"/>
-          <w:sz w:val="18"/>
-        </w:rPr>
-        <w:t>Comunicación oral  |  Modalidad: Por confirmar  |  Salón de Grados</w:t>
-      </w:r>
-    </w:p>
-    <w:p>
-      <w:pPr>
-        <w:keepNext/>
-        <w:spacing w:before="240" w:after="60"/>
-      </w:pPr>
-      <w:r>
-        <w:rPr>
-          <w:b/>
-          <w:color w:val="003973"/>
-        </w:rPr>
-        <w:t>12:00–12:15</w:t>
-      </w:r>
-    </w:p>
-    <w:p>
-      <w:pPr>
-        <w:keepNext/>
-        <w:spacing w:after="60"/>
-      </w:pPr>
-      <w:r>
-        <w:rPr>
-          <w:b/>
-          <w:sz w:val="22"/>
-        </w:rPr>
-        <w:t>“La Liga Científica Grand Prix”: gamificación y aprendizaje cooperativo en la enseñanza de Física y Química</w:t>
-      </w:r>
-    </w:p>
-    <w:p>
-      <w:pPr>
-        <w:keepNext/>
-        <w:spacing w:after="60"/>
-      </w:pPr>
-      <w:r>
-        <w:t>Denise Caja-Canseco, Irene Pérez-Sánchez y Vanessa Ortega-Quevedo</w:t>
-      </w:r>
-    </w:p>
-    <w:p>
-      <w:pPr>
-        <w:spacing w:after="100"/>
-      </w:pPr>
-      <w:r>
-        <w:rPr>
-          <w:color w:val="4D4D4D"/>
-          <w:sz w:val="18"/>
-        </w:rPr>
-        <w:t>Comunicación oral  |  Modalidad: Por confirmar  |  Salón de Grados</w:t>
-      </w:r>
-    </w:p>
-    <w:p>
-      <w:pPr>
-        <w:keepNext/>
-        <w:spacing w:before="240" w:after="60"/>
-      </w:pPr>
-      <w:r>
-        <w:rPr>
-          <w:b/>
-          <w:color w:val="003973"/>
-        </w:rPr>
-        <w:t>12:15–12:30</w:t>
-      </w:r>
-    </w:p>
-    <w:p>
-      <w:pPr>
-        <w:keepNext/>
-        <w:spacing w:after="60"/>
-      </w:pPr>
-      <w:r>
-        <w:rPr>
-          <w:b/>
-          <w:sz w:val="22"/>
-        </w:rPr>
-        <w:t>De leer a comprender: elaboración de esquemas y resúmenes como estrategias metacognitivas para el aprendizaje de las reacciones químicas en 3º de ESO</w:t>
-      </w:r>
-    </w:p>
-    <w:p>
-      <w:pPr>
-        <w:keepNext/>
-        <w:spacing w:after="60"/>
-      </w:pPr>
-      <w:r>
-        <w:t>Denise Caja-Canseco, Irene Pérez-Sánchez y Vanessa Ortega-Quevedo</w:t>
-      </w:r>
-    </w:p>
-    <w:p>
-      <w:pPr>
-        <w:spacing w:after="100"/>
-      </w:pPr>
-      <w:r>
-        <w:rPr>
-          <w:color w:val="4D4D4D"/>
-          <w:sz w:val="18"/>
-        </w:rPr>
-        <w:t>Comunicación oral  |  Modalidad: Por confirmar  |  Salón de Grados</w:t>
-      </w:r>
-    </w:p>
-    <w:p>
-      <w:r>
-        <w:rPr>
-          <w:sz w:val="16"/>
-        </w:rPr>
-        <w:t>Cada turno de comunicación oral reserva hasta 12 minutos de exposición y 3 de preguntas o transición.</w:t>
-      </w:r>
-    </w:p>
-    <w:p>
-      <w:r>
-        <w:br w:type="page"/>
-      </w:r>
-    </w:p>
-    <w:p>
-      <w:pPr>
-        <w:pStyle w:val="Subtitle"/>
-      </w:pPr>
-      <w:r>
-        <w:t>MARTES 17 DE NOVIEMBRE</w:t>
-      </w:r>
-    </w:p>
-    <w:p>
-      <w:pPr>
-        <w:pStyle w:val="Heading1"/>
-      </w:pPr>
-      <w:r>
-        <w:t>Sesión 3: Salud, inclusión y alfabetización</w:t>
-      </w:r>
-    </w:p>
-    <w:p>
-      <w:pPr/>
-      <w:r>
-        <w:t>Horario propuesto: Hora peninsular española</w:t>
-      </w:r>
-    </w:p>
-    <w:p>
-      <w:pPr>
-        <w:keepNext/>
-        <w:spacing w:before="240" w:after="60"/>
-      </w:pPr>
-      <w:r>
-        <w:rPr>
-          <w:b/>
-          <w:color w:val="003973"/>
-        </w:rPr>
-        <w:t>09:00–09:15</w:t>
-      </w:r>
-    </w:p>
-    <w:p>
-      <w:pPr>
-        <w:keepNext/>
-        <w:spacing w:after="60"/>
-      </w:pPr>
-      <w:r>
-        <w:rPr>
-          <w:b/>
-          <w:sz w:val="22"/>
-        </w:rPr>
-        <w:t>Internacionalización, inteligencia artificial generativa y contenidos digitales para la innovación docente en Enfermería: propuesta académica desde un proyecto de innovación docente</w:t>
-      </w:r>
-    </w:p>
-    <w:p>
-      <w:pPr>
-        <w:keepNext/>
-        <w:spacing w:after="60"/>
-      </w:pPr>
-      <w:r>
-        <w:t>Verónica Velasco González; Rosa Mª Cárdaba García; Carlos Durántez Fernández; Lucía Pérez Pérez; María Inmaculada Pérez Soto; Baldomero De Maya Sánchez; Jonathan Rojo Ruiz; Ana Casaux Huertas; Diego Macías Saint-Gerons; Leonor Pérez Ruiz</w:t>
-      </w:r>
-    </w:p>
-    <w:p>
-      <w:pPr>
-        <w:spacing w:after="100"/>
-      </w:pPr>
-      <w:r>
-        <w:rPr>
-          <w:color w:val="4D4D4D"/>
-          <w:sz w:val="18"/>
-        </w:rPr>
-        <w:t>Comunicación oral  |  Modalidad: Por confirmar  |  Salón de Grados</w:t>
-      </w:r>
-    </w:p>
-    <w:p>
-      <w:pPr>
-        <w:keepNext/>
-        <w:spacing w:before="240" w:after="60"/>
-      </w:pPr>
-      <w:r>
-        <w:rPr>
-          <w:b/>
-          <w:color w:val="003973"/>
-        </w:rPr>
-        <w:t>09:15–09:30</w:t>
-      </w:r>
-    </w:p>
-    <w:p>
-      <w:pPr>
-        <w:keepNext/>
-        <w:spacing w:after="60"/>
-      </w:pPr>
-      <w:r>
-        <w:rPr>
-          <w:b/>
-          <w:sz w:val="22"/>
-        </w:rPr>
-        <w:t>Estrategias para gestionar el Ciberbullying en los estudiantes de Educación Primaria: 6 a 12 años.</w:t>
-      </w:r>
-    </w:p>
-    <w:p>
-      <w:pPr>
-        <w:keepNext/>
-        <w:spacing w:after="60"/>
-      </w:pPr>
-      <w:r>
-        <w:t>Javier de Miguel del Pozo</w:t>
-      </w:r>
-    </w:p>
-    <w:p>
-      <w:pPr>
-        <w:spacing w:after="100"/>
-      </w:pPr>
-      <w:r>
-        <w:rPr>
-          <w:color w:val="4D4D4D"/>
-          <w:sz w:val="18"/>
-        </w:rPr>
-        <w:t>Comunicación oral  |  Modalidad: Por confirmar  |  Salón de Grados</w:t>
-      </w:r>
-    </w:p>
-    <w:p>
-      <w:pPr>
-        <w:keepNext/>
-        <w:spacing w:before="240" w:after="60"/>
-      </w:pPr>
-      <w:r>
-        <w:rPr>
-          <w:b/>
-          <w:color w:val="003973"/>
-        </w:rPr>
-        <w:t>09:30–09:45</w:t>
-      </w:r>
-    </w:p>
-    <w:p>
-      <w:pPr>
-        <w:keepNext/>
-        <w:spacing w:after="60"/>
-      </w:pPr>
-      <w:r>
-        <w:rPr>
-          <w:b/>
-          <w:sz w:val="22"/>
-        </w:rPr>
-        <w:t>El compromiso docente como motor de una educación transgresora, inclusiva y de calidad: desafíos y oportunidades para la escuela del siglo XXI</w:t>
-      </w:r>
-    </w:p>
-    <w:p>
-      <w:pPr>
-        <w:keepNext/>
-        <w:spacing w:after="60"/>
-      </w:pPr>
-      <w:r>
-        <w:t>Paula Lucía González Torres y Sandra González Torres</w:t>
-      </w:r>
-    </w:p>
-    <w:p>
-      <w:pPr>
-        <w:spacing w:after="100"/>
-      </w:pPr>
-      <w:r>
-        <w:rPr>
-          <w:color w:val="4D4D4D"/>
-          <w:sz w:val="18"/>
-        </w:rPr>
-        <w:t>Comunicación oral  |  Modalidad: Por confirmar  |  Salón de Grados</w:t>
-      </w:r>
-    </w:p>
-    <w:p>
-      <w:pPr>
-        <w:keepNext/>
-        <w:spacing w:before="240" w:after="60"/>
-      </w:pPr>
-      <w:r>
-        <w:rPr>
-          <w:b/>
-          <w:color w:val="003973"/>
-        </w:rPr>
-        <w:t>09:45–10:00</w:t>
-      </w:r>
-    </w:p>
-    <w:p>
-      <w:pPr>
-        <w:keepNext/>
-        <w:spacing w:after="60"/>
-      </w:pPr>
-      <w:r>
-        <w:rPr>
-          <w:b/>
-          <w:sz w:val="22"/>
-        </w:rPr>
-        <w:t>The Instrumental Role of Language: Innovation through Cognitive Discourse Functions</w:t>
-      </w:r>
-    </w:p>
-    <w:p>
-      <w:pPr>
-        <w:keepNext/>
-        <w:spacing w:after="60"/>
-      </w:pPr>
-      <w:r>
-        <w:t>María Ángeles Martín del Pozo</w:t>
-      </w:r>
-    </w:p>
-    <w:p>
-      <w:pPr>
-        <w:spacing w:after="100"/>
-      </w:pPr>
-      <w:r>
-        <w:rPr>
-          <w:color w:val="4D4D4D"/>
-          <w:sz w:val="18"/>
-        </w:rPr>
-        <w:t>Comunicación oral  |  Modalidad: Por confirmar  |  Salón de Grados</w:t>
-      </w:r>
-    </w:p>
-    <w:p>
-      <w:pPr>
-        <w:keepNext/>
-        <w:spacing w:before="240" w:after="60"/>
-      </w:pPr>
-      <w:r>
-        <w:rPr>
-          <w:b/>
-          <w:color w:val="003973"/>
-        </w:rPr>
-        <w:t>10:00–10:15</w:t>
-      </w:r>
-    </w:p>
-    <w:p>
-      <w:pPr>
-        <w:keepNext/>
-        <w:spacing w:after="60"/>
-      </w:pPr>
-      <w:r>
-        <w:rPr>
-          <w:b/>
-          <w:sz w:val="22"/>
-        </w:rPr>
-        <w:t>Desinformación en redes sociales y metodologías activas: El aula invertida (flipped classroom) para el desarrollo del pensamiento crítico y la ética informativa</w:t>
-      </w:r>
-    </w:p>
-    <w:p>
-      <w:pPr>
-        <w:keepNext/>
-        <w:spacing w:after="60"/>
-      </w:pPr>
-      <w:r>
-        <w:t>Sara Stefany Bullón Juárez</w:t>
-      </w:r>
-    </w:p>
-    <w:p>
-      <w:pPr>
-        <w:spacing w:after="100"/>
-      </w:pPr>
-      <w:r>
-        <w:rPr>
-          <w:color w:val="4D4D4D"/>
-          <w:sz w:val="18"/>
-        </w:rPr>
-        <w:t>Comunicación oral  |  Modalidad: Por confirmar  |  Salón de Grados</w:t>
-      </w:r>
-    </w:p>
-    <w:p>
-      <w:r>
-        <w:rPr>
-          <w:sz w:val="16"/>
-        </w:rPr>
-        <w:t>Cada turno de comunicación oral reserva hasta 12 minutos de exposición y 3 de preguntas o transición.</w:t>
-      </w:r>
-    </w:p>
-    <w:p>
-      <w:r>
-        <w:br w:type="page"/>
-      </w:r>
-    </w:p>
-    <w:p>
-      <w:pPr>
-        <w:pStyle w:val="Subtitle"/>
-      </w:pPr>
-      <w:r>
-        <w:t>MARTES 17 DE NOVIEMBRE</w:t>
-      </w:r>
-    </w:p>
-    <w:p>
-      <w:pPr>
-        <w:pStyle w:val="Heading1"/>
-      </w:pPr>
-      <w:r>
-        <w:t>Sesión 4: Ética, periodismo y tecnología</w:t>
-      </w:r>
-    </w:p>
-    <w:p>
-      <w:pPr/>
-      <w:r>
-        <w:t>Horario propuesto: Hora peninsular española</w:t>
-      </w:r>
-    </w:p>
-    <w:p>
-      <w:pPr>
-        <w:keepNext/>
-        <w:spacing w:before="240" w:after="60"/>
-      </w:pPr>
-      <w:r>
-        <w:rPr>
-          <w:b/>
-          <w:color w:val="003973"/>
-        </w:rPr>
-        <w:t>10:45–11:00</w:t>
-      </w:r>
-    </w:p>
-    <w:p>
-      <w:pPr>
-        <w:keepNext/>
-        <w:spacing w:after="60"/>
-      </w:pPr>
-      <w:r>
-        <w:rPr>
-          <w:b/>
-          <w:sz w:val="22"/>
-        </w:rPr>
-        <w:t>Cómo encajar la IA en el panorama educativo actual</w:t>
-      </w:r>
-    </w:p>
-    <w:p>
-      <w:pPr>
-        <w:keepNext/>
-        <w:spacing w:after="60"/>
-      </w:pPr>
-      <w:r>
-        <w:t>Lorena Martínez Benlloch y Paula Lucía González Torres</w:t>
-      </w:r>
-    </w:p>
-    <w:p>
-      <w:pPr>
-        <w:spacing w:after="100"/>
-      </w:pPr>
-      <w:r>
-        <w:rPr>
-          <w:color w:val="4D4D4D"/>
-          <w:sz w:val="18"/>
-        </w:rPr>
-        <w:t>Comunicación oral  |  Modalidad: Por confirmar  |  Salón de Grados</w:t>
-      </w:r>
-    </w:p>
-    <w:p>
-      <w:pPr>
-        <w:keepNext/>
-        <w:spacing w:before="240" w:after="60"/>
-      </w:pPr>
-      <w:r>
-        <w:rPr>
-          <w:b/>
-          <w:color w:val="003973"/>
-        </w:rPr>
-        <w:t>11:00–11:15</w:t>
-      </w:r>
-    </w:p>
-    <w:p>
-      <w:pPr>
-        <w:keepNext/>
-        <w:spacing w:after="60"/>
-      </w:pPr>
-      <w:r>
-        <w:rPr>
-          <w:b/>
-          <w:sz w:val="22"/>
-        </w:rPr>
-        <w:t>IA generativa y ética periodística: reconfiguración del relato sobre vulnerabilidad</w:t>
-      </w:r>
-    </w:p>
-    <w:p>
-      <w:pPr>
-        <w:keepNext/>
-        <w:spacing w:after="60"/>
-      </w:pPr>
-      <w:r>
-        <w:t>Marcos Ramallo Sebastián</w:t>
-      </w:r>
-    </w:p>
-    <w:p>
-      <w:pPr>
-        <w:spacing w:after="100"/>
-      </w:pPr>
-      <w:r>
-        <w:rPr>
-          <w:color w:val="4D4D4D"/>
-          <w:sz w:val="18"/>
-        </w:rPr>
-        <w:t>Comunicación oral  |  Modalidad: Por confirmar  |  Salón de Grados</w:t>
-      </w:r>
-    </w:p>
-    <w:p>
-      <w:pPr>
-        <w:keepNext/>
-        <w:spacing w:before="240" w:after="60"/>
-      </w:pPr>
-      <w:r>
-        <w:rPr>
-          <w:b/>
-          <w:color w:val="003973"/>
-        </w:rPr>
-        <w:t>11:15–11:30</w:t>
-      </w:r>
-    </w:p>
-    <w:p>
-      <w:pPr>
-        <w:keepNext/>
-        <w:spacing w:after="60"/>
-      </w:pPr>
-      <w:r>
-        <w:rPr>
-          <w:b/>
-          <w:sz w:val="22"/>
-        </w:rPr>
-        <w:t>Inteligencia artificial y desinformación política en la crisis de la vivienda: análisis discursivo en torno al desahucio de Maricarmen</w:t>
-      </w:r>
-    </w:p>
-    <w:p>
-      <w:pPr>
-        <w:keepNext/>
-        <w:spacing w:after="60"/>
-      </w:pPr>
-      <w:r>
-        <w:t>Juan-Manuel Castillo-Zamora</w:t>
-      </w:r>
-    </w:p>
-    <w:p>
-      <w:pPr>
-        <w:spacing w:after="100"/>
-      </w:pPr>
-      <w:r>
-        <w:rPr>
-          <w:color w:val="4D4D4D"/>
-          <w:sz w:val="18"/>
-        </w:rPr>
-        <w:t>Comunicación oral  |  Modalidad: Por confirmar  |  Salón de Grados</w:t>
-      </w:r>
-    </w:p>
-    <w:p>
-      <w:pPr>
-        <w:keepNext/>
-        <w:spacing w:before="240" w:after="60"/>
-      </w:pPr>
-      <w:r>
-        <w:rPr>
-          <w:b/>
-          <w:color w:val="003973"/>
-        </w:rPr>
-        <w:t>11:30–11:45</w:t>
-      </w:r>
-    </w:p>
-    <w:p>
-      <w:pPr>
-        <w:keepNext/>
-        <w:spacing w:after="60"/>
-      </w:pPr>
-      <w:r>
-        <w:rPr>
-          <w:b/>
-          <w:sz w:val="22"/>
-        </w:rPr>
-        <w:t>IA generativa en el periodismo de investigación en Guatemala: rutinas productivas, verificación y salvaguardas éticas</w:t>
-      </w:r>
-    </w:p>
-    <w:p>
-      <w:pPr>
-        <w:keepNext/>
-        <w:spacing w:after="60"/>
-      </w:pPr>
-      <w:r>
-        <w:t>José Pablo del Águila García</w:t>
-      </w:r>
-    </w:p>
-    <w:p>
-      <w:pPr>
-        <w:spacing w:after="100"/>
-      </w:pPr>
-      <w:r>
-        <w:rPr>
-          <w:color w:val="4D4D4D"/>
-          <w:sz w:val="18"/>
-        </w:rPr>
-        <w:t>Comunicación oral  |  Modalidad: Por confirmar  |  Salón de Grados</w:t>
-      </w:r>
-    </w:p>
-    <w:p>
-      <w:pPr>
-        <w:keepNext/>
-        <w:spacing w:before="240" w:after="60"/>
-      </w:pPr>
-      <w:r>
-        <w:rPr>
-          <w:b/>
-          <w:color w:val="003973"/>
-        </w:rPr>
-        <w:t>11:45–12:00</w:t>
-      </w:r>
-    </w:p>
-    <w:p>
-      <w:pPr>
-        <w:keepNext/>
-        <w:spacing w:after="60"/>
-      </w:pPr>
-      <w:r>
-        <w:rPr>
-          <w:b/>
-          <w:sz w:val="22"/>
-        </w:rPr>
-        <w:t>Uso de Inteligencia Artificial Generativa para la Resolución de Problemas Prácticos de Redes: un Estudio Comparativo</w:t>
-      </w:r>
-    </w:p>
-    <w:p>
-      <w:pPr>
-        <w:keepNext/>
-        <w:spacing w:after="60"/>
-      </w:pPr>
-      <w:r>
-        <w:t>José Pablo Recinos Guzmán</w:t>
-      </w:r>
-    </w:p>
-    <w:p>
-      <w:pPr>
-        <w:spacing w:after="100"/>
-      </w:pPr>
-      <w:r>
-        <w:rPr>
-          <w:color w:val="4D4D4D"/>
-          <w:sz w:val="18"/>
-        </w:rPr>
-        <w:t>Comunicación oral  |  Modalidad: Por confirmar  |  Salón de Grados</w:t>
-      </w:r>
-    </w:p>
-    <w:p>
-      <w:r>
-        <w:rPr>
-          <w:sz w:val="16"/>
-        </w:rPr>
-        <w:t>Cada turno de comunicación oral reserva hasta 12 minutos de exposición y 3 de preguntas o transición.</w:t>
-      </w:r>
-    </w:p>
-    <w:p>
-      <w:r>
-        <w:br w:type="page"/>
-      </w:r>
-    </w:p>
-    <w:p>
-      <w:pPr>
-        <w:pStyle w:val="Heading1"/>
-      </w:pPr>
-      <w:r>
-        <w:t>Mesa redonda y talleres</w:t>
-      </w:r>
-    </w:p>
-    <w:p>
-      <w:pPr>
-        <w:keepNext/>
-        <w:spacing w:before="240" w:after="60"/>
-      </w:pPr>
-      <w:r>
-        <w:rPr>
-          <w:b/>
-          <w:color w:val="003973"/>
-        </w:rPr>
-        <w:t>LUNES 16: 13:00–13:45</w:t>
+        <w:t>13:00–13:45</w:t>
       </w:r>
     </w:p>
     <w:p>
@@ -4057,6 +3533,43 @@
       </w:r>
     </w:p>
     <w:p>
+      <w:r>
+        <w:br w:type="page"/>
+      </w:r>
+    </w:p>
+    <w:p>
+      <w:pPr>
+        <w:pStyle w:val="Heading1"/>
+      </w:pPr>
+      <w:r>
+        <w:t>Lunes 16 de noviembre</w:t>
+      </w:r>
+    </w:p>
+    <w:p>
+      <w:pPr>
+        <w:spacing w:after="100"/>
+      </w:pPr>
+      <w:r>
+        <w:rPr>
+          <w:b w:val="0"/>
+          <w:sz w:val="20"/>
+        </w:rPr>
+        <w:t>13:45–18:30 : Hora peninsular española</w:t>
+      </w:r>
+    </w:p>
+    <w:p>
+      <w:pPr>
+        <w:spacing w:after="100" w:before="140"/>
+      </w:pPr>
+      <w:r>
+        <w:rPr>
+          <w:b/>
+          <w:sz w:val="20"/>
+        </w:rPr>
+        <w:t>13:45–16:00: Pausa para almuerzo</w:t>
+      </w:r>
+    </w:p>
+    <w:p>
       <w:pPr>
         <w:keepNext/>
         <w:spacing w:before="240" w:after="60"/>
@@ -4066,7 +3579,66 @@
           <w:b/>
           <w:color w:val="003973"/>
         </w:rPr>
-        <w:t>LUNES 16: 17:15–18:00</w:t>
+        <w:t>16:00–17:00</w:t>
+      </w:r>
+    </w:p>
+    <w:p>
+      <w:pPr>
+        <w:keepNext/>
+        <w:spacing w:after="60"/>
+      </w:pPr>
+      <w:r>
+        <w:rPr>
+          <w:b/>
+          <w:sz w:val="22"/>
+        </w:rPr>
+        <w:t>Los cuentos como herramienta didáctica en el aula de inglés: Reading Awakening</w:t>
+      </w:r>
+    </w:p>
+    <w:p>
+      <w:pPr>
+        <w:keepNext/>
+        <w:spacing w:after="60"/>
+      </w:pPr>
+      <w:r>
+        <w:t>Débora Rascón Estébanez</w:t>
+      </w:r>
+    </w:p>
+    <w:p>
+      <w:pPr>
+        <w:spacing w:after="100"/>
+      </w:pPr>
+      <w:r>
+        <w:rPr>
+          <w:color w:val="4D4D4D"/>
+          <w:sz w:val="18"/>
+        </w:rPr>
+        <w:t>Taller: 60 minutos propuestos  |  Modalidad: Por confirmar  |  Aula 117</w:t>
+      </w:r>
+    </w:p>
+    <w:p>
+      <w:pPr>
+        <w:spacing w:after="100" w:before="140"/>
+      </w:pPr>
+      <w:r>
+        <w:rPr>
+          <w:b/>
+          <w:sz w:val="20"/>
+        </w:rPr>
+        <w:t>17:00–17:15: Descanso</w:t>
+      </w:r>
+    </w:p>
+    <w:p>
+      <w:pPr>
+        <w:keepNext/>
+        <w:spacing w:before="240" w:after="60"/>
+      </w:pPr>
+      <w:r>
+        <w:rPr>
+          <w:b/>
+          <w:color w:val="003973"/>
+        </w:rPr>
+        <w:t>17:15–18:00</w:t>
       </w:r>
     </w:p>
     <w:p>
@@ -4113,10 +3685,14 @@
     </w:p>
     <w:p>
       <w:pPr>
-        <w:pStyle w:val="Heading2"/>
+        <w:spacing w:after="100" w:before="140"/>
       </w:pPr>
       <w:r>
-        <w:t>Comunicación de la tarde</w:t>
+        <w:rPr>
+          <w:b/>
+          <w:sz w:val="20"/>
+        </w:rPr>
+        <w:t>18:00–18:15: Descanso</w:t>
       </w:r>
     </w:p>
     <w:p>
@@ -4129,7 +3705,7 @@
           <w:b/>
           <w:color w:val="003973"/>
         </w:rPr>
-        <w:t>LUNES 16: 18:15–18:30</w:t>
+        <w:t>18:15–18:30</w:t>
       </w:r>
     </w:p>
     <w:p>
@@ -4167,16 +3743,658 @@
       </w:r>
     </w:p>
     <w:p>
+      <w:r>
+        <w:br w:type="page"/>
+      </w:r>
+    </w:p>
+    <w:p>
+      <w:pPr>
+        <w:pStyle w:val="Heading1"/>
+      </w:pPr>
+      <w:r>
+        <w:t>Martes 17 de noviembre</w:t>
+      </w:r>
+    </w:p>
+    <w:p>
+      <w:pPr>
+        <w:spacing w:after="100"/>
+      </w:pPr>
+      <w:r>
+        <w:rPr>
+          <w:b w:val="0"/>
+          <w:sz w:val="20"/>
+        </w:rPr>
+        <w:t>09:00–10:45 : Hora peninsular española</w:t>
+      </w:r>
+    </w:p>
+    <w:p>
       <w:pPr>
         <w:keepNext/>
-        <w:spacing w:before="240" w:after="60"/>
+        <w:spacing w:before="180" w:after="100"/>
       </w:pPr>
       <w:r>
         <w:rPr>
           <w:b/>
           <w:color w:val="003973"/>
         </w:rPr>
-        <w:t>MARTES 17: 13:15–14:15</w:t>
+        <w:t>09:00–10:15: Sesión 3: Salud, inclusión y alfabetización: Salón de Grados</w:t>
+      </w:r>
+    </w:p>
+    <w:p>
+      <w:pPr>
+        <w:keepNext/>
+        <w:spacing w:before="240" w:after="60"/>
+      </w:pPr>
+      <w:r>
+        <w:rPr>
+          <w:b/>
+          <w:color w:val="003973"/>
+        </w:rPr>
+        <w:t>09:00–09:15</w:t>
+      </w:r>
+    </w:p>
+    <w:p>
+      <w:pPr>
+        <w:keepNext/>
+        <w:spacing w:after="60"/>
+      </w:pPr>
+      <w:r>
+        <w:rPr>
+          <w:b/>
+          <w:sz w:val="22"/>
+        </w:rPr>
+        <w:t>Internacionalización, inteligencia artificial generativa y contenidos digitales para la innovación docente en Enfermería: propuesta académica desde un proyecto de innovación docente</w:t>
+      </w:r>
+    </w:p>
+    <w:p>
+      <w:pPr>
+        <w:keepNext/>
+        <w:spacing w:after="60"/>
+      </w:pPr>
+      <w:r>
+        <w:t>Verónica Velasco González; Rosa Mª Cárdaba García; Carlos Durántez Fernández; Lucía Pérez Pérez; María Inmaculada Pérez Soto; Baldomero De Maya Sánchez; Jonathan Rojo Ruiz; Ana Casaux Huertas; Diego Macías Saint-Gerons; Leonor Pérez Ruiz</w:t>
+      </w:r>
+    </w:p>
+    <w:p>
+      <w:pPr>
+        <w:spacing w:after="100"/>
+      </w:pPr>
+      <w:r>
+        <w:rPr>
+          <w:color w:val="4D4D4D"/>
+          <w:sz w:val="18"/>
+        </w:rPr>
+        <w:t>Comunicación oral  |  Modalidad: Por confirmar  |  Salón de Grados</w:t>
+      </w:r>
+    </w:p>
+    <w:p>
+      <w:pPr>
+        <w:keepNext/>
+        <w:spacing w:before="240" w:after="60"/>
+      </w:pPr>
+      <w:r>
+        <w:rPr>
+          <w:b/>
+          <w:color w:val="003973"/>
+        </w:rPr>
+        <w:t>09:15–09:30</w:t>
+      </w:r>
+    </w:p>
+    <w:p>
+      <w:pPr>
+        <w:keepNext/>
+        <w:spacing w:after="60"/>
+      </w:pPr>
+      <w:r>
+        <w:rPr>
+          <w:b/>
+          <w:sz w:val="22"/>
+        </w:rPr>
+        <w:t>Estrategias para gestionar el Ciberbullying en los estudiantes de Educación Primaria: 6 a 12 años.</w:t>
+      </w:r>
+    </w:p>
+    <w:p>
+      <w:pPr>
+        <w:keepNext/>
+        <w:spacing w:after="60"/>
+      </w:pPr>
+      <w:r>
+        <w:t>Javier de Miguel del Pozo</w:t>
+      </w:r>
+    </w:p>
+    <w:p>
+      <w:pPr>
+        <w:spacing w:after="100"/>
+      </w:pPr>
+      <w:r>
+        <w:rPr>
+          <w:color w:val="4D4D4D"/>
+          <w:sz w:val="18"/>
+        </w:rPr>
+        <w:t>Comunicación oral  |  Modalidad: Por confirmar  |  Salón de Grados</w:t>
+      </w:r>
+    </w:p>
+    <w:p>
+      <w:pPr>
+        <w:keepNext/>
+        <w:spacing w:before="240" w:after="60"/>
+      </w:pPr>
+      <w:r>
+        <w:rPr>
+          <w:b/>
+          <w:color w:val="003973"/>
+        </w:rPr>
+        <w:t>09:30–09:45</w:t>
+      </w:r>
+    </w:p>
+    <w:p>
+      <w:pPr>
+        <w:keepNext/>
+        <w:spacing w:after="60"/>
+      </w:pPr>
+      <w:r>
+        <w:rPr>
+          <w:b/>
+          <w:sz w:val="22"/>
+        </w:rPr>
+        <w:t>El compromiso docente como motor de una educación transgresora, inclusiva y de calidad: desafíos y oportunidades para la escuela del siglo XXI</w:t>
+      </w:r>
+    </w:p>
+    <w:p>
+      <w:pPr>
+        <w:keepNext/>
+        <w:spacing w:after="60"/>
+      </w:pPr>
+      <w:r>
+        <w:t>Paula Lucía González Torres y Sandra González Torres</w:t>
+      </w:r>
+    </w:p>
+    <w:p>
+      <w:pPr>
+        <w:spacing w:after="100"/>
+      </w:pPr>
+      <w:r>
+        <w:rPr>
+          <w:color w:val="4D4D4D"/>
+          <w:sz w:val="18"/>
+        </w:rPr>
+        <w:t>Comunicación oral  |  Modalidad: Por confirmar  |  Salón de Grados</w:t>
+      </w:r>
+    </w:p>
+    <w:p>
+      <w:pPr>
+        <w:keepNext/>
+        <w:spacing w:before="240" w:after="60"/>
+      </w:pPr>
+      <w:r>
+        <w:rPr>
+          <w:b/>
+          <w:color w:val="003973"/>
+        </w:rPr>
+        <w:t>09:45–10:00</w:t>
+      </w:r>
+    </w:p>
+    <w:p>
+      <w:pPr>
+        <w:keepNext/>
+        <w:spacing w:after="60"/>
+      </w:pPr>
+      <w:r>
+        <w:rPr>
+          <w:b/>
+          <w:sz w:val="22"/>
+        </w:rPr>
+        <w:t>The Instrumental Role of Language: Innovation through Cognitive Discourse Functions</w:t>
+      </w:r>
+    </w:p>
+    <w:p>
+      <w:pPr>
+        <w:keepNext/>
+        <w:spacing w:after="60"/>
+      </w:pPr>
+      <w:r>
+        <w:t>María Ángeles Martín del Pozo</w:t>
+      </w:r>
+    </w:p>
+    <w:p>
+      <w:pPr>
+        <w:spacing w:after="100"/>
+      </w:pPr>
+      <w:r>
+        <w:rPr>
+          <w:color w:val="4D4D4D"/>
+          <w:sz w:val="18"/>
+        </w:rPr>
+        <w:t>Comunicación oral  |  Modalidad: Por confirmar  |  Salón de Grados</w:t>
+      </w:r>
+    </w:p>
+    <w:p>
+      <w:pPr>
+        <w:keepNext/>
+        <w:spacing w:before="240" w:after="60"/>
+      </w:pPr>
+      <w:r>
+        <w:rPr>
+          <w:b/>
+          <w:color w:val="003973"/>
+        </w:rPr>
+        <w:t>10:00–10:15</w:t>
+      </w:r>
+    </w:p>
+    <w:p>
+      <w:pPr>
+        <w:keepNext/>
+        <w:spacing w:after="60"/>
+      </w:pPr>
+      <w:r>
+        <w:rPr>
+          <w:b/>
+          <w:sz w:val="22"/>
+        </w:rPr>
+        <w:t>Desinformación en redes sociales y metodologías activas: El aula invertida (flipped classroom) para el desarrollo del pensamiento crítico y la ética informativa</w:t>
+      </w:r>
+    </w:p>
+    <w:p>
+      <w:pPr>
+        <w:keepNext/>
+        <w:spacing w:after="60"/>
+      </w:pPr>
+      <w:r>
+        <w:t>Sara Stefany Bullón Juárez</w:t>
+      </w:r>
+    </w:p>
+    <w:p>
+      <w:pPr>
+        <w:spacing w:after="100"/>
+      </w:pPr>
+      <w:r>
+        <w:rPr>
+          <w:color w:val="4D4D4D"/>
+          <w:sz w:val="18"/>
+        </w:rPr>
+        <w:t>Comunicación oral  |  Modalidad: Por confirmar  |  Salón de Grados</w:t>
+      </w:r>
+    </w:p>
+    <w:p>
+      <w:pPr>
+        <w:spacing w:after="100" w:before="140"/>
+      </w:pPr>
+      <w:r>
+        <w:rPr>
+          <w:b/>
+          <w:sz w:val="20"/>
+        </w:rPr>
+        <w:t>10:15–10:45: Descanso</w:t>
+      </w:r>
+    </w:p>
+    <w:p>
+      <w:r>
+        <w:br w:type="page"/>
+      </w:r>
+    </w:p>
+    <w:p>
+      <w:pPr>
+        <w:pStyle w:val="Heading1"/>
+      </w:pPr>
+      <w:r>
+        <w:t>Martes 17 de noviembre</w:t>
+      </w:r>
+    </w:p>
+    <w:p>
+      <w:pPr>
+        <w:spacing w:after="100"/>
+      </w:pPr>
+      <w:r>
+        <w:rPr>
+          <w:b w:val="0"/>
+          <w:sz w:val="20"/>
+        </w:rPr>
+        <w:t>10:45–13:15 : Hora peninsular española</w:t>
+      </w:r>
+    </w:p>
+    <w:p>
+      <w:pPr>
+        <w:keepNext/>
+        <w:spacing w:before="180" w:after="100"/>
+      </w:pPr>
+      <w:r>
+        <w:rPr>
+          <w:b/>
+          <w:color w:val="003973"/>
+        </w:rPr>
+        <w:t>10:45–12:00: Sesión 4: Ética, periodismo y tecnología: Salón de Grados</w:t>
+      </w:r>
+    </w:p>
+    <w:p>
+      <w:pPr>
+        <w:keepNext/>
+        <w:spacing w:before="240" w:after="60"/>
+      </w:pPr>
+      <w:r>
+        <w:rPr>
+          <w:b/>
+          <w:color w:val="003973"/>
+        </w:rPr>
+        <w:t>10:45–11:00</w:t>
+      </w:r>
+    </w:p>
+    <w:p>
+      <w:pPr>
+        <w:keepNext/>
+        <w:spacing w:after="60"/>
+      </w:pPr>
+      <w:r>
+        <w:rPr>
+          <w:b/>
+          <w:sz w:val="22"/>
+        </w:rPr>
+        <w:t>Cómo encajar la IA en el panorama educativo actual</w:t>
+      </w:r>
+    </w:p>
+    <w:p>
+      <w:pPr>
+        <w:keepNext/>
+        <w:spacing w:after="60"/>
+      </w:pPr>
+      <w:r>
+        <w:t>Lorena Martínez Benlloch y Paula Lucía González Torres</w:t>
+      </w:r>
+    </w:p>
+    <w:p>
+      <w:pPr>
+        <w:spacing w:after="100"/>
+      </w:pPr>
+      <w:r>
+        <w:rPr>
+          <w:color w:val="4D4D4D"/>
+          <w:sz w:val="18"/>
+        </w:rPr>
+        <w:t>Comunicación oral  |  Modalidad: Por confirmar  |  Salón de Grados</w:t>
+      </w:r>
+    </w:p>
+    <w:p>
+      <w:pPr>
+        <w:keepNext/>
+        <w:spacing w:before="240" w:after="60"/>
+      </w:pPr>
+      <w:r>
+        <w:rPr>
+          <w:b/>
+          <w:color w:val="003973"/>
+        </w:rPr>
+        <w:t>11:00–11:15</w:t>
+      </w:r>
+    </w:p>
+    <w:p>
+      <w:pPr>
+        <w:keepNext/>
+        <w:spacing w:after="60"/>
+      </w:pPr>
+      <w:r>
+        <w:rPr>
+          <w:b/>
+          <w:sz w:val="22"/>
+        </w:rPr>
+        <w:t>IA generativa y ética periodística: reconfiguración del relato sobre vulnerabilidad</w:t>
+      </w:r>
+    </w:p>
+    <w:p>
+      <w:pPr>
+        <w:keepNext/>
+        <w:spacing w:after="60"/>
+      </w:pPr>
+      <w:r>
+        <w:t>Marcos Ramallo Sebastián</w:t>
+      </w:r>
+    </w:p>
+    <w:p>
+      <w:pPr>
+        <w:spacing w:after="100"/>
+      </w:pPr>
+      <w:r>
+        <w:rPr>
+          <w:color w:val="4D4D4D"/>
+          <w:sz w:val="18"/>
+        </w:rPr>
+        <w:t>Comunicación oral  |  Modalidad: Por confirmar  |  Salón de Grados</w:t>
+      </w:r>
+    </w:p>
+    <w:p>
+      <w:pPr>
+        <w:keepNext/>
+        <w:spacing w:before="240" w:after="60"/>
+      </w:pPr>
+      <w:r>
+        <w:rPr>
+          <w:b/>
+          <w:color w:val="003973"/>
+        </w:rPr>
+        <w:t>11:15–11:30</w:t>
+      </w:r>
+    </w:p>
+    <w:p>
+      <w:pPr>
+        <w:keepNext/>
+        <w:spacing w:after="60"/>
+      </w:pPr>
+      <w:r>
+        <w:rPr>
+          <w:b/>
+          <w:sz w:val="22"/>
+        </w:rPr>
+        <w:t>Inteligencia artificial y desinformación política en la crisis de la vivienda: análisis discursivo en torno al desahucio de Maricarmen</w:t>
+      </w:r>
+    </w:p>
+    <w:p>
+      <w:pPr>
+        <w:keepNext/>
+        <w:spacing w:after="60"/>
+      </w:pPr>
+      <w:r>
+        <w:t>Juan-Manuel Castillo-Zamora</w:t>
+      </w:r>
+    </w:p>
+    <w:p>
+      <w:pPr>
+        <w:spacing w:after="100"/>
+      </w:pPr>
+      <w:r>
+        <w:rPr>
+          <w:color w:val="4D4D4D"/>
+          <w:sz w:val="18"/>
+        </w:rPr>
+        <w:t>Comunicación oral  |  Modalidad: Por confirmar  |  Salón de Grados</w:t>
+      </w:r>
+    </w:p>
+    <w:p>
+      <w:pPr>
+        <w:keepNext/>
+        <w:spacing w:before="240" w:after="60"/>
+      </w:pPr>
+      <w:r>
+        <w:rPr>
+          <w:b/>
+          <w:color w:val="003973"/>
+        </w:rPr>
+        <w:t>11:30–11:45</w:t>
+      </w:r>
+    </w:p>
+    <w:p>
+      <w:pPr>
+        <w:keepNext/>
+        <w:spacing w:after="60"/>
+      </w:pPr>
+      <w:r>
+        <w:rPr>
+          <w:b/>
+          <w:sz w:val="22"/>
+        </w:rPr>
+        <w:t>IA generativa en el periodismo de investigación en Guatemala: rutinas productivas, verificación y salvaguardas éticas</w:t>
+      </w:r>
+    </w:p>
+    <w:p>
+      <w:pPr>
+        <w:keepNext/>
+        <w:spacing w:after="60"/>
+      </w:pPr>
+      <w:r>
+        <w:t>José Pablo del Águila García</w:t>
+      </w:r>
+    </w:p>
+    <w:p>
+      <w:pPr>
+        <w:spacing w:after="100"/>
+      </w:pPr>
+      <w:r>
+        <w:rPr>
+          <w:color w:val="4D4D4D"/>
+          <w:sz w:val="18"/>
+        </w:rPr>
+        <w:t>Comunicación oral  |  Modalidad: Por confirmar  |  Salón de Grados</w:t>
+      </w:r>
+    </w:p>
+    <w:p>
+      <w:pPr>
+        <w:keepNext/>
+        <w:spacing w:before="240" w:after="60"/>
+      </w:pPr>
+      <w:r>
+        <w:rPr>
+          <w:b/>
+          <w:color w:val="003973"/>
+        </w:rPr>
+        <w:t>11:45–12:00</w:t>
+      </w:r>
+    </w:p>
+    <w:p>
+      <w:pPr>
+        <w:keepNext/>
+        <w:spacing w:after="60"/>
+      </w:pPr>
+      <w:r>
+        <w:rPr>
+          <w:b/>
+          <w:sz w:val="22"/>
+        </w:rPr>
+        <w:t>Uso de Inteligencia Artificial Generativa para la Resolución de Problemas Prácticos de Redes: un Estudio Comparativo</w:t>
+      </w:r>
+    </w:p>
+    <w:p>
+      <w:pPr>
+        <w:keepNext/>
+        <w:spacing w:after="60"/>
+      </w:pPr>
+      <w:r>
+        <w:t>José Pablo Recinos Guzmán</w:t>
+      </w:r>
+    </w:p>
+    <w:p>
+      <w:pPr>
+        <w:spacing w:after="100"/>
+      </w:pPr>
+      <w:r>
+        <w:rPr>
+          <w:color w:val="4D4D4D"/>
+          <w:sz w:val="18"/>
+        </w:rPr>
+        <w:t>Comunicación oral  |  Modalidad: Por confirmar  |  Salón de Grados</w:t>
+      </w:r>
+    </w:p>
+    <w:p>
+      <w:pPr>
+        <w:spacing w:after="100" w:before="140"/>
+      </w:pPr>
+      <w:r>
+        <w:rPr>
+          <w:b/>
+          <w:sz w:val="20"/>
+        </w:rPr>
+        <w:t>12:00–12:15: Descanso</w:t>
+      </w:r>
+    </w:p>
+    <w:p>
+      <w:pPr>
+        <w:keepNext/>
+        <w:spacing w:before="240" w:after="60"/>
+      </w:pPr>
+      <w:r>
+        <w:rPr>
+          <w:b/>
+          <w:color w:val="003973"/>
+        </w:rPr>
+        <w:t>12:15–13:15</w:t>
+      </w:r>
+    </w:p>
+    <w:p>
+      <w:pPr>
+        <w:keepNext/>
+        <w:spacing w:after="60"/>
+      </w:pPr>
+      <w:r>
+        <w:rPr>
+          <w:b/>
+          <w:sz w:val="22"/>
+        </w:rPr>
+        <w:t>De la idea al aula: creación de recursos educativos con IA</w:t>
+      </w:r>
+    </w:p>
+    <w:p>
+      <w:pPr>
+        <w:keepNext/>
+        <w:spacing w:after="60"/>
+      </w:pPr>
+      <w:r>
+        <w:t>María Sanabria</w:t>
+      </w:r>
+    </w:p>
+    <w:p>
+      <w:pPr>
+        <w:spacing w:after="100"/>
+      </w:pPr>
+      <w:r>
+        <w:rPr>
+          <w:color w:val="4D4D4D"/>
+          <w:sz w:val="18"/>
+        </w:rPr>
+        <w:t>Taller: 60 minutos propuestos  |  Modalidad: Por confirmar  |  Aula 117</w:t>
+      </w:r>
+    </w:p>
+    <w:p>
+      <w:r>
+        <w:br w:type="page"/>
+      </w:r>
+    </w:p>
+    <w:p>
+      <w:pPr>
+        <w:pStyle w:val="Heading1"/>
+      </w:pPr>
+      <w:r>
+        <w:t>Martes 17 de noviembre</w:t>
+      </w:r>
+    </w:p>
+    <w:p>
+      <w:pPr>
+        <w:spacing w:after="100"/>
+      </w:pPr>
+      <w:r>
+        <w:rPr>
+          <w:b w:val="0"/>
+          <w:sz w:val="20"/>
+        </w:rPr>
+        <w:t>13:15–18:30 : Hora peninsular española</w:t>
+      </w:r>
+    </w:p>
+    <w:p>
+      <w:pPr>
+        <w:keepNext/>
+        <w:spacing w:before="240" w:after="60"/>
+      </w:pPr>
+      <w:r>
+        <w:rPr>
+          <w:b/>
+          <w:color w:val="003973"/>
+        </w:rPr>
+        <w:t>13:15–14:15</w:t>
       </w:r>
     </w:p>
     <w:p>
@@ -4215,15 +4433,27 @@
     </w:p>
     <w:p>
       <w:pPr>
+        <w:spacing w:after="100" w:before="140"/>
+      </w:pPr>
+      <w:r>
+        <w:rPr>
+          <w:b/>
+          <w:sz w:val="20"/>
+        </w:rPr>
+        <w:t>14:15–16:00: Pausa para almuerzo</w:t>
+      </w:r>
+    </w:p>
+    <w:p>
+      <w:pPr>
         <w:keepNext/>
-        <w:spacing w:before="240" w:after="60"/>
+        <w:spacing w:before="180" w:after="100"/>
       </w:pPr>
       <w:r>
         <w:rPr>
           <w:b/>
           <w:color w:val="003973"/>
         </w:rPr>
-        <w:t>MARTES 17: 16:00–18:15</w:t>
+        <w:t>16:00–17:00: Taller: primera parte: Aula 117</w:t>
       </w:r>
     </w:p>
     <w:p>
@@ -4254,49 +4484,35 @@
       </w:pPr>
       <w:r>
         <w:rPr>
-          <w:color w:val="4D4D4D"/>
+          <w:b w:val="0"/>
           <w:sz w:val="18"/>
         </w:rPr>
-        <w:t>Taller: 120 minutos y 15 minutos de descanso  |  Modalidad: Por confirmar  |  Aula 117</w:t>
+        <w:t>Modalidad: Por confirmar</w:t>
       </w:r>
     </w:p>
     <w:p>
+      <w:pPr>
+        <w:spacing w:after="100" w:before="140"/>
+      </w:pPr>
       <w:r>
-        <w:br w:type="page"/>
+        <w:rPr>
+          <w:b/>
+          <w:sz w:val="20"/>
+        </w:rPr>
+        <w:t>17:00–17:15: Descanso</w:t>
       </w:r>
     </w:p>
     <w:p>
       <w:pPr>
-        <w:pStyle w:val="Heading1"/>
-      </w:pPr>
-      <w:r>
-        <w:t>Proyección de pósteres</w:t>
-      </w:r>
-    </w:p>
-    <w:p>
-      <w:r>
-        <w:rPr>
-          <w:b/>
-        </w:rPr>
-        <w:t>Lunes 16 de noviembre: 10:15–10:30</w:t>
-      </w:r>
-    </w:p>
-    <w:p>
-      <w:r>
-        <w:t>Proyección conjunta durante 15 minutos del descanso de 10:15–10:45. Hora peninsular española.</w:t>
-      </w:r>
-    </w:p>
-    <w:p>
-      <w:pPr>
         <w:keepNext/>
-        <w:spacing w:before="240" w:after="60"/>
+        <w:spacing w:before="180" w:after="100"/>
       </w:pPr>
       <w:r>
         <w:rPr>
           <w:b/>
           <w:color w:val="003973"/>
         </w:rPr>
-        <w:t>PÓSTER 1</w:t>
+        <w:t>17:15–18:15: Taller: segunda parte: Aula 117</w:t>
       </w:r>
     </w:p>
     <w:p>
@@ -4309,7 +4525,7 @@
           <w:b/>
           <w:sz w:val="22"/>
         </w:rPr>
-        <w:t>De la clínica a la investigación: formación multimodal de una red de matronas para la recogida estandarizada de datos</w:t>
+        <w:t>Activa tu potencial desde la educación</w:t>
       </w:r>
     </w:p>
     <w:p>
@@ -4318,7 +4534,7 @@
         <w:spacing w:after="60"/>
       </w:pPr>
       <w:r>
-        <w:t>Nuria García Cuadrado y Verónica Velasco González</w:t>
+        <w:t>Lorena Martínez Benlloch y Paula Lucía González Torres</w:t>
       </w:r>
     </w:p>
     <w:p>
@@ -4327,71 +4543,44 @@
       </w:pPr>
       <w:r>
         <w:rPr>
-          <w:color w:val="4D4D4D"/>
+          <w:b w:val="0"/>
           <w:sz w:val="18"/>
         </w:rPr>
-        <w:t>Póster académico  |  Modalidad: Por confirmar  |  Salón de Grados</w:t>
+        <w:t>Modalidad: Por confirmar</w:t>
       </w:r>
     </w:p>
     <w:p>
       <w:pPr>
-        <w:keepNext/>
-        <w:spacing w:before="240" w:after="60"/>
+        <w:spacing w:after="100" w:before="140"/>
       </w:pPr>
       <w:r>
         <w:rPr>
           <w:b/>
-          <w:color w:val="003973"/>
+          <w:sz w:val="20"/>
         </w:rPr>
-        <w:t>PÓSTER 2</w:t>
+        <w:t>18:15–18:30: Clausura: Salón de Grados</w:t>
       </w:r>
     </w:p>
     <w:p>
       <w:pPr>
-        <w:keepNext/>
-        <w:spacing w:after="60"/>
+        <w:spacing w:after="100"/>
       </w:pPr>
       <w:r>
         <w:rPr>
-          <w:b/>
-          <w:sz w:val="22"/>
+          <w:b w:val="0"/>
+          <w:sz w:val="18"/>
         </w:rPr>
-        <w:t>Diseño de una aplicación digital para la gestión y divulgación científica en clubes de ciencias de educación básica</w:t>
+        <w:t>Cada comunicación oral reserva hasta 12 minutos de exposición y 3 de preguntas o transición.</w:t>
       </w:r>
     </w:p>
     <w:p>
       <w:pPr>
-        <w:keepNext/>
-        <w:spacing w:after="60"/>
-      </w:pPr>
-      <w:r>
-        <w:t>Loanda Alves Triboli</w:t>
-      </w:r>
-    </w:p>
-    <w:p>
-      <w:pPr>
         <w:spacing w:after="100"/>
       </w:pPr>
       <w:r>
         <w:rPr>
-          <w:color w:val="4D4D4D"/>
+          <w:b w:val="0"/>
           <w:sz w:val="18"/>
-        </w:rPr>
-        <w:t>Póster académico  |  Modalidad: Online  |  Salón de Grados</w:t>
-      </w:r>
-    </w:p>
-    <w:p>
-      <w:r>
-        <w:rPr>
-          <w:sz w:val="18"/>
-        </w:rPr>
-        <w:t>La participación online no presupone conexión en directo durante la proyección. El procedimiento de presentación se comunicará a las autoras.</w:t>
-      </w:r>
-    </w:p>
-    <w:p>
-      <w:r>
-        <w:rPr>
-          <w:sz w:val="16"/>
         </w:rPr>
         <w:t>Web del congreso: https://flabxproject.github.io/flabxconference/</w:t>
       </w:r>

</xml_diff>

<commit_message>
Añadir taller de Alicia y completar coautoría de Laura
</commit_message>
<xml_diff>
--- a/assets/programa-provisional-flabx.docx
+++ b/assets/programa-provisional-flabx.docx
@@ -1028,7 +1028,111 @@
                 <w:color w:val="000000"/>
                 <w:sz w:val="18"/>
               </w:rPr>
-              <w:t>13:45–16:00</w:t>
+              <w:t>13:45–14:45</w:t>
+            </w:r>
+          </w:p>
+        </w:tc>
+        <w:tc>
+          <w:tcPr>
+            <w:tcW w:type="dxa" w:w="7030"/>
+            <w:shd w:fill="FFFFFF"/>
+            <w:tcMar>
+              <w:top w:w="75" w:type="dxa"/>
+              <w:left w:w="75" w:type="dxa"/>
+              <w:bottom w:w="75" w:type="dxa"/>
+              <w:right w:w="75" w:type="dxa"/>
+            </w:tcMar>
+            <w:tcBorders>
+              <w:top w:val="single" w:sz="4" w:color="D9D9D9"/>
+              <w:left w:val="single" w:sz="4" w:color="D9D9D9"/>
+              <w:bottom w:val="single" w:sz="4" w:color="D9D9D9"/>
+              <w:right w:val="single" w:sz="4" w:color="D9D9D9"/>
+            </w:tcBorders>
+            <w:vAlign w:val="center"/>
+          </w:tcPr>
+          <w:p>
+            <w:pPr>
+              <w:spacing w:after="30" w:before="30" w:line="252" w:lineRule="auto"/>
+            </w:pPr>
+            <w:r>
+              <w:rPr>
+                <w:b w:val="0"/>
+                <w:color w:val="000000"/>
+                <w:sz w:val="18"/>
+              </w:rPr>
+              <w:t>Taller: LEVEL UP! Gamificación inclusiva en el aula de Inglés</w:t>
+              <w:br/>
+              <w:t>Alicia Mínguez Blanco: Aula 117</w:t>
+            </w:r>
+          </w:p>
+        </w:tc>
+      </w:tr>
+      <w:tr>
+        <w:trPr>
+          <w:cantSplit/>
+          <w:cantSplit/>
+        </w:trPr>
+        <w:tc>
+          <w:tcPr>
+            <w:tcW w:type="dxa" w:w="1134"/>
+            <w:shd w:fill="FFFFFF"/>
+            <w:tcMar>
+              <w:top w:w="75" w:type="dxa"/>
+              <w:left w:w="75" w:type="dxa"/>
+              <w:bottom w:w="75" w:type="dxa"/>
+              <w:right w:w="75" w:type="dxa"/>
+            </w:tcMar>
+            <w:tcBorders>
+              <w:top w:val="single" w:sz="4" w:color="D9D9D9"/>
+              <w:left w:val="single" w:sz="4" w:color="D9D9D9"/>
+              <w:bottom w:val="single" w:sz="4" w:color="D9D9D9"/>
+              <w:right w:val="single" w:sz="4" w:color="D9D9D9"/>
+            </w:tcBorders>
+            <w:vAlign w:val="center"/>
+          </w:tcPr>
+          <w:p>
+            <w:pPr>
+              <w:spacing w:after="30" w:before="30" w:line="252" w:lineRule="auto"/>
+            </w:pPr>
+            <w:r>
+              <w:rPr>
+                <w:b w:val="0"/>
+                <w:color w:val="000000"/>
+                <w:sz w:val="18"/>
+              </w:rPr>
+              <w:t>Lunes 16</w:t>
+            </w:r>
+          </w:p>
+        </w:tc>
+        <w:tc>
+          <w:tcPr>
+            <w:tcW w:type="dxa" w:w="1587"/>
+            <w:shd w:fill="FFFFFF"/>
+            <w:tcMar>
+              <w:top w:w="75" w:type="dxa"/>
+              <w:left w:w="75" w:type="dxa"/>
+              <w:bottom w:w="75" w:type="dxa"/>
+              <w:right w:w="75" w:type="dxa"/>
+            </w:tcMar>
+            <w:tcBorders>
+              <w:top w:val="single" w:sz="4" w:color="D9D9D9"/>
+              <w:left w:val="single" w:sz="4" w:color="D9D9D9"/>
+              <w:bottom w:val="single" w:sz="4" w:color="D9D9D9"/>
+              <w:right w:val="single" w:sz="4" w:color="D9D9D9"/>
+            </w:tcBorders>
+            <w:vAlign w:val="center"/>
+          </w:tcPr>
+          <w:p>
+            <w:pPr>
+              <w:spacing w:after="30" w:before="30" w:line="252" w:lineRule="auto"/>
+            </w:pPr>
+            <w:r>
+              <w:rPr>
+                <w:b w:val="0"/>
+                <w:color w:val="000000"/>
+                <w:sz w:val="18"/>
+              </w:rPr>
+              <w:t>14:45–16:00</w:t>
             </w:r>
           </w:p>
         </w:tc>
@@ -2943,7 +3047,7 @@
         <w:spacing w:after="60"/>
       </w:pPr>
       <w:r>
-        <w:t>Laura Esteban Gómez</w:t>
+        <w:t>Laura Esteban Gómez, Susana Revenga Novo y Ruth Pinedo González</w:t>
       </w:r>
     </w:p>
     <w:p>
@@ -3559,14 +3663,66 @@
     </w:p>
     <w:p>
       <w:pPr>
-        <w:spacing w:after="100" w:before="140"/>
+        <w:keepNext/>
+        <w:spacing w:after="100"/>
       </w:pPr>
       <w:r>
         <w:rPr>
           <w:b/>
           <w:sz w:val="20"/>
         </w:rPr>
-        <w:t>13:45–16:00: Pausa para almuerzo</w:t>
+        <w:t>13:45–14:45</w:t>
+      </w:r>
+    </w:p>
+    <w:p>
+      <w:pPr>
+        <w:keepNext/>
+        <w:spacing w:after="100"/>
+      </w:pPr>
+      <w:r>
+        <w:rPr>
+          <w:b/>
+          <w:sz w:val="22"/>
+        </w:rPr>
+        <w:t>LEVEL UP! Gamificación inclusiva en el aula de Inglés</w:t>
+      </w:r>
+    </w:p>
+    <w:p>
+      <w:pPr>
+        <w:keepNext/>
+        <w:spacing w:after="100"/>
+      </w:pPr>
+      <w:r>
+        <w:rPr>
+          <w:b w:val="0"/>
+          <w:sz w:val="20"/>
+        </w:rPr>
+        <w:t>Alicia Mínguez Blanco</w:t>
+      </w:r>
+    </w:p>
+    <w:p>
+      <w:pPr>
+        <w:keepNext/>
+        <w:spacing w:after="100"/>
+      </w:pPr>
+      <w:r>
+        <w:rPr>
+          <w:b w:val="0"/>
+          <w:sz w:val="18"/>
+        </w:rPr>
+        <w:t>Taller: 60 minutos propuestos  |  Modalidad: Por confirmar  |  Aula 117</w:t>
+      </w:r>
+    </w:p>
+    <w:p>
+      <w:pPr>
+        <w:spacing w:after="100" w:before="140"/>
+      </w:pPr>
+      <w:r>
+        <w:rPr>
+          <w:b/>
+          <w:sz w:val="20"/>
+        </w:rPr>
+        <w:t>14:45–16:00: Pausa para almuerzo</w:t>
       </w:r>
     </w:p>
     <w:p>

</xml_diff>

<commit_message>
Confirmar modalidad online de Ana Gabriela y comunicación de Paula
</commit_message>
<xml_diff>
--- a/assets/programa-provisional-flabx.docx
+++ b/assets/programa-provisional-flabx.docx
@@ -3200,7 +3200,7 @@
           <w:color w:val="4D4D4D"/>
           <w:sz w:val="18"/>
         </w:rPr>
-        <w:t>Comunicación oral  |  Modalidad: Por confirmar  |  Salón de Grados</w:t>
+        <w:t>Comunicación oral  |  Modalidad: Online  |  Salón de Grados</w:t>
       </w:r>
     </w:p>
     <w:p>
@@ -4074,7 +4074,7 @@
           <w:color w:val="4D4D4D"/>
           <w:sz w:val="18"/>
         </w:rPr>
-        <w:t>Comunicación oral  |  Modalidad: Por confirmar  |  Salón de Grados</w:t>
+        <w:t>Comunicación oral  |  Modalidad: Online  |  Salón de Grados</w:t>
       </w:r>
     </w:p>
     <w:p>

</xml_diff>

<commit_message>
Adelantar comunicación de Juan-Manuel a las 09:15 del martes
</commit_message>
<xml_diff>
--- a/assets/programa-provisional-flabx.docx
+++ b/assets/programa-provisional-flabx.docx
@@ -4006,7 +4006,7 @@
           <w:b/>
           <w:sz w:val="22"/>
         </w:rPr>
-        <w:t>Estrategias para gestionar el Ciberbullying en los estudiantes de Educación Primaria: 6 a 12 años.</w:t>
+        <w:t>Inteligencia artificial y desinformación política en la crisis de la vivienda: análisis discursivo en torno al desahucio de Maricarmen</w:t>
       </w:r>
     </w:p>
     <w:p>
@@ -4015,7 +4015,7 @@
         <w:spacing w:after="60"/>
       </w:pPr>
       <w:r>
-        <w:t>Javier de Miguel del Pozo</w:t>
+        <w:t>Juan-Manuel Castillo-Zamora</w:t>
       </w:r>
     </w:p>
     <w:p>
@@ -4338,7 +4338,7 @@
           <w:b/>
           <w:sz w:val="22"/>
         </w:rPr>
-        <w:t>Inteligencia artificial y desinformación política en la crisis de la vivienda: análisis discursivo en torno al desahucio de Maricarmen</w:t>
+        <w:t>Estrategias para gestionar el Ciberbullying en los estudiantes de Educación Primaria: 6 a 12 años.</w:t>
       </w:r>
     </w:p>
     <w:p>
@@ -4347,7 +4347,7 @@
         <w:spacing w:after="60"/>
       </w:pPr>
       <w:r>
-        <w:t>Juan-Manuel Castillo-Zamora</w:t>
+        <w:t>Javier de Miguel del Pozo</w:t>
       </w:r>
     </w:p>
     <w:p>

</xml_diff>